<commit_message>
Show a picture of each map as it opens on every lesson page
Each lesson's map.image now points at the picture taken by the Map
pictures workflow, with alt text that describes the picture without
giving answers. The hero picture's link starts with "Open map" for
screen readers (Hub page builder 3.6, page renderer 3.6). The checker
fails if a lesson's picture is missing from the repository.

App 0.20.0; Map pictures 1.0 added to the versions table; content
patch versions for all ten lessons.

Co-Authored-By: Claude Opus 5.5 <noreply@anthropic.com>
Claude-Session: https://claude.ai/code/session_0128KNeNnUpTLAu4VezDWZow
</commit_message>
<xml_diff>
--- a/resources/dist/mapmaker/sheets/civil-war-battlefields-student-sheet-en.docx
+++ b/resources/dist/mapmaker/sheets/civil-war-battlefields-student-sheet-en.docx
@@ -64,7 +64,7 @@
         </w:rPr>
         <w:t xml:space="preserve">Open the map in MapMaker: </w:t>
       </w:r>
-      <w:hyperlink w:history="1" r:id="rIdgksipamidhijld8wuixwz">
+      <w:hyperlink w:history="1" r:id="rId3ydm0w1eu1abcfbbwmbe0">
         <w:r>
           <w:rPr>
             <w:i/>
@@ -767,7 +767,7 @@
       <w:pStyle w:val="Credits"/>
     </w:pPr>
     <w:r>
-      <w:t xml:space="preserve">Civil War Battlefields, 0.7.1.</w:t>
+      <w:t xml:space="preserve">Civil War Battlefields, 0.7.2.</w:t>
     </w:r>
   </w:p>
 </w:ftr>

</xml_diff>